<commit_message>
feat(phase2): sign-in throttling, photo endpoint, subfolder routing, docs
Implements the deep-check suggestions:

- Sign-in throttling: new login_attempts table and LoginAttemptModel.
  Five wrong passwords for an email (or twenty from one IP) within 15
  minutes return 429 with Retry-After, even with the right password.
- GET /api/photos/{id} serves listing photos from outside the web root
  with the listing's visibility rules; listings expose cover_photo_id.
- The router strips the folder holding index.php, so the API works at
  the site root or in a subfolder.
- Replaced stale docs: BookSwap_Project_Document.md now matches the
  official Phase 1 document; ERD_DATA_DICTIONARY.md and DB_API_GUIDE.md
  are generated from the live schema and route table. Phase 2 document
  and PROGRESS.md updated.

243/243 functional and 40/40 security checks pass on the PHP built-in
server and on Apache at the site root and in a subfolder.

Co-Authored-By: Claude Opus 5 <noreply@anthropic.com>
</commit_message>
<xml_diff>
--- a/docs/BookSwap_Phase2_Database_Backend.docx
+++ b/docs/BookSwap_Phase2_Database_Backend.docx
@@ -333,7 +333,7 @@
           <w:sz w:val="24"/>
           <w:szCs w:val="24"/>
         </w:rPr>
-        <w:t xml:space="preserve">The schema consists of sixteen tables: the fifteen entities of the Phase 1 ERD and a user_sessions table required for session management. Reference data (genres, formats, age categories, condition grades, and meetup locations) is retired through an is_active flag instead of being deleted, so listings created under a retired entry stay readable. Table 1 lists each table.</w:t>
+        <w:t xml:space="preserve">The schema consists of seventeen tables: the fifteen entities of the Phase 1 ERD, plus user_sessions for session management and login_attempts for sign-in throttling. Reference data (genres, formats, age categories, condition grades, and meetup locations) is retired through an is_active flag instead of being deleted, so listings created under a retired entry stay readable. Table 1 lists each table.</w:t>
       </w:r>
     </w:p>
     <w:p>
@@ -2162,6 +2162,116 @@
             <w:tcBorders>
               <w:top w:val="none" w:color="FFFFFF" w:sz="0"/>
               <w:left w:val="none" w:color="FFFFFF" w:sz="0"/>
+              <w:bottom w:val="none" w:color="FFFFFF" w:sz="0"/>
+              <w:right w:val="none" w:color="FFFFFF" w:sz="0"/>
+            </w:tcBorders>
+            <w:tcMar>
+              <w:top w:type="dxa" w:w="60"/>
+              <w:left w:type="dxa" w:w="80"/>
+              <w:bottom w:type="dxa" w:w="60"/>
+              <w:right w:type="dxa" w:w="80"/>
+            </w:tcMar>
+            <w:vAlign w:val="top"/>
+          </w:tcPr>
+          <w:p>
+            <w:pPr>
+              <w:spacing w:after="0" w:line="240"/>
+            </w:pPr>
+            <w:r>
+              <w:rPr>
+                <w:rFonts w:ascii="Times New Roman" w:cs="Times New Roman" w:eastAsia="Times New Roman" w:hAnsi="Times New Roman"/>
+                <w:b w:val="false"/>
+                <w:bCs w:val="false"/>
+                <w:i w:val="false"/>
+                <w:iCs w:val="false"/>
+                <w:sz w:val="22"/>
+                <w:szCs w:val="22"/>
+              </w:rPr>
+              <w:t xml:space="preserve">user_sessions</w:t>
+            </w:r>
+          </w:p>
+        </w:tc>
+        <w:tc>
+          <w:tcPr>
+            <w:tcW w:type="dxa" w:w="2100"/>
+            <w:tcBorders>
+              <w:top w:val="none" w:color="FFFFFF" w:sz="0"/>
+              <w:left w:val="none" w:color="FFFFFF" w:sz="0"/>
+              <w:bottom w:val="none" w:color="FFFFFF" w:sz="0"/>
+              <w:right w:val="none" w:color="FFFFFF" w:sz="0"/>
+            </w:tcBorders>
+            <w:tcMar>
+              <w:top w:type="dxa" w:w="60"/>
+              <w:left w:type="dxa" w:w="80"/>
+              <w:bottom w:type="dxa" w:w="60"/>
+              <w:right w:type="dxa" w:w="80"/>
+            </w:tcMar>
+            <w:vAlign w:val="top"/>
+          </w:tcPr>
+          <w:p>
+            <w:pPr>
+              <w:spacing w:after="0" w:line="240"/>
+            </w:pPr>
+            <w:r>
+              <w:rPr>
+                <w:rFonts w:ascii="Times New Roman" w:cs="Times New Roman" w:eastAsia="Times New Roman" w:hAnsi="Times New Roman"/>
+                <w:b w:val="false"/>
+                <w:bCs w:val="false"/>
+                <w:i w:val="false"/>
+                <w:iCs w:val="false"/>
+                <w:sz w:val="22"/>
+                <w:szCs w:val="22"/>
+              </w:rPr>
+              <w:t xml:space="preserve">Beyond the ERD</w:t>
+            </w:r>
+          </w:p>
+        </w:tc>
+        <w:tc>
+          <w:tcPr>
+            <w:tcW w:type="dxa" w:w="5260"/>
+            <w:tcBorders>
+              <w:top w:val="none" w:color="FFFFFF" w:sz="0"/>
+              <w:left w:val="none" w:color="FFFFFF" w:sz="0"/>
+              <w:bottom w:val="none" w:color="FFFFFF" w:sz="0"/>
+              <w:right w:val="none" w:color="FFFFFF" w:sz="0"/>
+            </w:tcBorders>
+            <w:tcMar>
+              <w:top w:type="dxa" w:w="60"/>
+              <w:left w:type="dxa" w:w="80"/>
+              <w:bottom w:type="dxa" w:w="60"/>
+              <w:right w:type="dxa" w:w="80"/>
+            </w:tcMar>
+            <w:vAlign w:val="top"/>
+          </w:tcPr>
+          <w:p>
+            <w:pPr>
+              <w:spacing w:after="0" w:line="240"/>
+            </w:pPr>
+            <w:r>
+              <w:rPr>
+                <w:rFonts w:ascii="Times New Roman" w:cs="Times New Roman" w:eastAsia="Times New Roman" w:hAnsi="Times New Roman"/>
+                <w:b w:val="false"/>
+                <w:bCs w:val="false"/>
+                <w:i w:val="false"/>
+                <w:iCs w:val="false"/>
+                <w:sz w:val="22"/>
+                <w:szCs w:val="22"/>
+              </w:rPr>
+              <w:t xml:space="preserve">Server-side sessions behind login tokens, so sessions can be ended at once.</w:t>
+            </w:r>
+          </w:p>
+        </w:tc>
+      </w:tr>
+      <w:tr>
+        <w:trPr>
+          <w:cantSplit/>
+        </w:trPr>
+        <w:tc>
+          <w:tcPr>
+            <w:tcW w:type="dxa" w:w="2000"/>
+            <w:tcBorders>
+              <w:top w:val="none" w:color="FFFFFF" w:sz="0"/>
+              <w:left w:val="none" w:color="FFFFFF" w:sz="0"/>
               <w:bottom w:val="single" w:color="000000" w:sz="6"/>
               <w:right w:val="none" w:color="FFFFFF" w:sz="0"/>
             </w:tcBorders>
@@ -2187,7 +2297,7 @@
                 <w:sz w:val="22"/>
                 <w:szCs w:val="22"/>
               </w:rPr>
-              <w:t xml:space="preserve">user_sessions</w:t>
+              <w:t xml:space="preserve">login_attempts</w:t>
             </w:r>
           </w:p>
         </w:tc>
@@ -2257,7 +2367,7 @@
                 <w:sz w:val="22"/>
                 <w:szCs w:val="22"/>
               </w:rPr>
-              <w:t xml:space="preserve">Server-side sessions behind login tokens, so sessions can be ended at once.</w:t>
+              <w:t xml:space="preserve">Recent sign-in attempts per email and IP address, used to throttle password guessing.</w:t>
             </w:r>
           </w:p>
         </w:tc>
@@ -3465,6 +3575,116 @@
             <w:tcBorders>
               <w:top w:val="none" w:color="FFFFFF" w:sz="0"/>
               <w:left w:val="none" w:color="FFFFFF" w:sz="0"/>
+              <w:bottom w:val="none" w:color="FFFFFF" w:sz="0"/>
+              <w:right w:val="none" w:color="FFFFFF" w:sz="0"/>
+            </w:tcBorders>
+            <w:tcMar>
+              <w:top w:type="dxa" w:w="60"/>
+              <w:left w:type="dxa" w:w="80"/>
+              <w:bottom w:type="dxa" w:w="60"/>
+              <w:right w:type="dxa" w:w="80"/>
+            </w:tcMar>
+            <w:vAlign w:val="top"/>
+          </w:tcPr>
+          <w:p>
+            <w:pPr>
+              <w:spacing w:after="0" w:line="240"/>
+            </w:pPr>
+            <w:r>
+              <w:rPr>
+                <w:rFonts w:ascii="Times New Roman" w:cs="Times New Roman" w:eastAsia="Times New Roman" w:hAnsi="Times New Roman"/>
+                <w:b w:val="false"/>
+                <w:bCs w:val="false"/>
+                <w:i w:val="false"/>
+                <w:iCs w:val="false"/>
+                <w:sz w:val="22"/>
+                <w:szCs w:val="22"/>
+              </w:rPr>
+              <w:t xml:space="preserve">(not in ERD)</w:t>
+            </w:r>
+          </w:p>
+        </w:tc>
+        <w:tc>
+          <w:tcPr>
+            <w:tcW w:type="dxa" w:w="3300"/>
+            <w:tcBorders>
+              <w:top w:val="none" w:color="FFFFFF" w:sz="0"/>
+              <w:left w:val="none" w:color="FFFFFF" w:sz="0"/>
+              <w:bottom w:val="none" w:color="FFFFFF" w:sz="0"/>
+              <w:right w:val="none" w:color="FFFFFF" w:sz="0"/>
+            </w:tcBorders>
+            <w:tcMar>
+              <w:top w:type="dxa" w:w="60"/>
+              <w:left w:type="dxa" w:w="80"/>
+              <w:bottom w:type="dxa" w:w="60"/>
+              <w:right w:type="dxa" w:w="80"/>
+            </w:tcMar>
+            <w:vAlign w:val="top"/>
+          </w:tcPr>
+          <w:p>
+            <w:pPr>
+              <w:spacing w:after="0" w:line="240"/>
+            </w:pPr>
+            <w:r>
+              <w:rPr>
+                <w:rFonts w:ascii="Times New Roman" w:cs="Times New Roman" w:eastAsia="Times New Roman" w:hAnsi="Times New Roman"/>
+                <w:b w:val="false"/>
+                <w:bCs w:val="false"/>
+                <w:i w:val="false"/>
+                <w:iCs w:val="false"/>
+                <w:sz w:val="22"/>
+                <w:szCs w:val="22"/>
+              </w:rPr>
+              <w:t xml:space="preserve">user_sessions</w:t>
+            </w:r>
+          </w:p>
+        </w:tc>
+        <w:tc>
+          <w:tcPr>
+            <w:tcW w:type="dxa" w:w="2960"/>
+            <w:tcBorders>
+              <w:top w:val="none" w:color="FFFFFF" w:sz="0"/>
+              <w:left w:val="none" w:color="FFFFFF" w:sz="0"/>
+              <w:bottom w:val="none" w:color="FFFFFF" w:sz="0"/>
+              <w:right w:val="none" w:color="FFFFFF" w:sz="0"/>
+            </w:tcBorders>
+            <w:tcMar>
+              <w:top w:type="dxa" w:w="60"/>
+              <w:left w:type="dxa" w:w="80"/>
+              <w:bottom w:type="dxa" w:w="60"/>
+              <w:right w:type="dxa" w:w="80"/>
+            </w:tcMar>
+            <w:vAlign w:val="top"/>
+          </w:tcPr>
+          <w:p>
+            <w:pPr>
+              <w:spacing w:after="0" w:line="240"/>
+            </w:pPr>
+            <w:r>
+              <w:rPr>
+                <w:rFonts w:ascii="Times New Roman" w:cs="Times New Roman" w:eastAsia="Times New Roman" w:hAnsi="Times New Roman"/>
+                <w:b w:val="false"/>
+                <w:bCs w:val="false"/>
+                <w:i w:val="false"/>
+                <w:iCs w:val="false"/>
+                <w:sz w:val="22"/>
+                <w:szCs w:val="22"/>
+              </w:rPr>
+              <w:t xml:space="preserve">Final Project Guide: session management.</w:t>
+            </w:r>
+          </w:p>
+        </w:tc>
+      </w:tr>
+      <w:tr>
+        <w:trPr>
+          <w:cantSplit/>
+        </w:trPr>
+        <w:tc>
+          <w:tcPr>
+            <w:tcW w:type="dxa" w:w="3100"/>
+            <w:tcBorders>
+              <w:top w:val="none" w:color="FFFFFF" w:sz="0"/>
+              <w:left w:val="none" w:color="FFFFFF" w:sz="0"/>
               <w:bottom w:val="single" w:color="000000" w:sz="6"/>
               <w:right w:val="none" w:color="FFFFFF" w:sz="0"/>
             </w:tcBorders>
@@ -3525,7 +3745,7 @@
                 <w:sz w:val="22"/>
                 <w:szCs w:val="22"/>
               </w:rPr>
-              <w:t xml:space="preserve">user_sessions</w:t>
+              <w:t xml:space="preserve">login_attempts</w:t>
             </w:r>
           </w:p>
         </w:tc>
@@ -3560,7 +3780,7 @@
                 <w:sz w:val="22"/>
                 <w:szCs w:val="22"/>
               </w:rPr>
-              <w:t xml:space="preserve">Final Project Guide: session management.</w:t>
+              <w:t xml:space="preserve">Final Project Guide: authentication and security (sign-in throttling).</w:t>
             </w:r>
           </w:p>
         </w:tc>
@@ -8316,7 +8536,7 @@
           <w:sz w:val="24"/>
           <w:szCs w:val="24"/>
         </w:rPr>
-        <w:t xml:space="preserve">All database access is confined to eleven model classes. Controllers never issue SQL directly, and every statement is a prepared statement with bound parameters, which removes the possibility of SQL injection through user input. Deletion is a status change rather than physical removal, so withdrawn listings, cancelled exchanges, and retired taxonomy entries remain auditable. Table 4 summarises the operations each model provides.</w:t>
+        <w:t xml:space="preserve">All database access is confined to twelve model classes. Controllers never issue SQL directly, and every statement is a prepared statement with bound parameters, which removes the possibility of SQL injection through user input. Deletion is a status change rather than physical removal, so withdrawn listings, cancelled exchanges, and retired taxonomy entries remain auditable. Table 4 summarises the operations each model provides.</w:t>
       </w:r>
     </w:p>
     <w:p>
@@ -8847,6 +9067,151 @@
                 <w:sz w:val="22"/>
                 <w:szCs w:val="22"/>
               </w:rPr>
+              <w:t xml:space="preserve">LoginAttemptModel</w:t>
+            </w:r>
+          </w:p>
+        </w:tc>
+        <w:tc>
+          <w:tcPr>
+            <w:tcW w:type="dxa" w:w="1950"/>
+            <w:tcBorders>
+              <w:top w:val="none" w:color="FFFFFF" w:sz="0"/>
+              <w:left w:val="none" w:color="FFFFFF" w:sz="0"/>
+              <w:bottom w:val="none" w:color="FFFFFF" w:sz="0"/>
+              <w:right w:val="none" w:color="FFFFFF" w:sz="0"/>
+            </w:tcBorders>
+            <w:tcMar>
+              <w:top w:type="dxa" w:w="60"/>
+              <w:left w:type="dxa" w:w="80"/>
+              <w:bottom w:type="dxa" w:w="60"/>
+              <w:right w:type="dxa" w:w="80"/>
+            </w:tcMar>
+            <w:vAlign w:val="top"/>
+          </w:tcPr>
+          <w:p>
+            <w:pPr>
+              <w:spacing w:after="0" w:line="240"/>
+            </w:pPr>
+            <w:r>
+              <w:rPr>
+                <w:rFonts w:ascii="Times New Roman" w:cs="Times New Roman" w:eastAsia="Times New Roman" w:hAnsi="Times New Roman"/>
+                <w:b w:val="false"/>
+                <w:bCs w:val="false"/>
+                <w:i w:val="false"/>
+                <w:iCs w:val="false"/>
+                <w:sz w:val="22"/>
+                <w:szCs w:val="22"/>
+              </w:rPr>
+              <w:t xml:space="preserve">record()</w:t>
+            </w:r>
+          </w:p>
+        </w:tc>
+        <w:tc>
+          <w:tcPr>
+            <w:tcW w:type="dxa" w:w="3000"/>
+            <w:tcBorders>
+              <w:top w:val="none" w:color="FFFFFF" w:sz="0"/>
+              <w:left w:val="none" w:color="FFFFFF" w:sz="0"/>
+              <w:bottom w:val="none" w:color="FFFFFF" w:sz="0"/>
+              <w:right w:val="none" w:color="FFFFFF" w:sz="0"/>
+            </w:tcBorders>
+            <w:tcMar>
+              <w:top w:type="dxa" w:w="60"/>
+              <w:left w:type="dxa" w:w="80"/>
+              <w:bottom w:type="dxa" w:w="60"/>
+              <w:right w:type="dxa" w:w="80"/>
+            </w:tcMar>
+            <w:vAlign w:val="top"/>
+          </w:tcPr>
+          <w:p>
+            <w:pPr>
+              <w:spacing w:after="0" w:line="240"/>
+            </w:pPr>
+            <w:r>
+              <w:rPr>
+                <w:rFonts w:ascii="Times New Roman" w:cs="Times New Roman" w:eastAsia="Times New Roman" w:hAnsi="Times New Roman"/>
+                <w:b w:val="false"/>
+                <w:bCs w:val="false"/>
+                <w:i w:val="false"/>
+                <w:iCs w:val="false"/>
+                <w:sz w:val="22"/>
+                <w:szCs w:val="22"/>
+              </w:rPr>
+              <w:t xml:space="preserve">secondsUntilAllowed()</w:t>
+            </w:r>
+          </w:p>
+        </w:tc>
+        <w:tc>
+          <w:tcPr>
+            <w:tcW w:type="dxa" w:w="2710"/>
+            <w:tcBorders>
+              <w:top w:val="none" w:color="FFFFFF" w:sz="0"/>
+              <w:left w:val="none" w:color="FFFFFF" w:sz="0"/>
+              <w:bottom w:val="none" w:color="FFFFFF" w:sz="0"/>
+              <w:right w:val="none" w:color="FFFFFF" w:sz="0"/>
+            </w:tcBorders>
+            <w:tcMar>
+              <w:top w:type="dxa" w:w="60"/>
+              <w:left w:type="dxa" w:w="80"/>
+              <w:bottom w:type="dxa" w:w="60"/>
+              <w:right w:type="dxa" w:w="80"/>
+            </w:tcMar>
+            <w:vAlign w:val="top"/>
+          </w:tcPr>
+          <w:p>
+            <w:pPr>
+              <w:spacing w:after="0" w:line="240"/>
+            </w:pPr>
+            <w:r>
+              <w:rPr>
+                <w:rFonts w:ascii="Times New Roman" w:cs="Times New Roman" w:eastAsia="Times New Roman" w:hAnsi="Times New Roman"/>
+                <w:b w:val="false"/>
+                <w:bCs w:val="false"/>
+                <w:i w:val="false"/>
+                <w:iCs w:val="false"/>
+                <w:sz w:val="22"/>
+                <w:szCs w:val="22"/>
+              </w:rPr>
+              <w:t xml:space="preserve">Attempts older than a day are pruned on each successful sign-in.</w:t>
+            </w:r>
+          </w:p>
+        </w:tc>
+      </w:tr>
+      <w:tr>
+        <w:trPr>
+          <w:cantSplit/>
+        </w:trPr>
+        <w:tc>
+          <w:tcPr>
+            <w:tcW w:type="dxa" w:w="1700"/>
+            <w:tcBorders>
+              <w:top w:val="none" w:color="FFFFFF" w:sz="0"/>
+              <w:left w:val="none" w:color="FFFFFF" w:sz="0"/>
+              <w:bottom w:val="none" w:color="FFFFFF" w:sz="0"/>
+              <w:right w:val="none" w:color="FFFFFF" w:sz="0"/>
+            </w:tcBorders>
+            <w:tcMar>
+              <w:top w:type="dxa" w:w="60"/>
+              <w:left w:type="dxa" w:w="80"/>
+              <w:bottom w:type="dxa" w:w="60"/>
+              <w:right w:type="dxa" w:w="80"/>
+            </w:tcMar>
+            <w:vAlign w:val="top"/>
+          </w:tcPr>
+          <w:p>
+            <w:pPr>
+              <w:spacing w:after="0" w:line="240"/>
+            </w:pPr>
+            <w:r>
+              <w:rPr>
+                <w:rFonts w:ascii="Times New Roman" w:cs="Times New Roman" w:eastAsia="Times New Roman" w:hAnsi="Times New Roman"/>
+                <w:b w:val="false"/>
+                <w:bCs w:val="false"/>
+                <w:i w:val="false"/>
+                <w:iCs w:val="false"/>
+                <w:sz w:val="22"/>
+                <w:szCs w:val="22"/>
+              </w:rPr>
               <w:t xml:space="preserve">ListingModel</w:t>
             </w:r>
           </w:p>
@@ -8917,7 +9282,7 @@
                 <w:sz w:val="22"/>
                 <w:szCs w:val="22"/>
               </w:rPr>
-              <w:t xml:space="preserve">findById(), getPhotos(), searchCatalogue(), getByUserId(), getPending(), getIdle()</w:t>
+              <w:t xml:space="preserve">findById(), getPhotos(), findPhoto(), searchCatalogue(), getByUserId(), getPending(), getIdle()</w:t>
             </w:r>
           </w:p>
         </w:tc>
@@ -10467,7 +10832,43 @@
           <w:sz w:val="24"/>
           <w:szCs w:val="24"/>
         </w:rPr>
-        <w:t xml:space="preserve">5.3 Role-Based Access Control</w:t>
+        <w:t xml:space="preserve">5.3 Sign-in Throttling</w:t>
+      </w:r>
+    </w:p>
+    <w:p>
+      <w:pPr>
+        <w:spacing w:after="160" w:line="276"/>
+        <w:jc w:val="both"/>
+      </w:pPr>
+      <w:r>
+        <w:rPr>
+          <w:rFonts w:ascii="Times New Roman" w:cs="Times New Roman" w:eastAsia="Times New Roman" w:hAnsi="Times New Roman"/>
+          <w:b w:val="false"/>
+          <w:bCs w:val="false"/>
+          <w:i w:val="false"/>
+          <w:iCs w:val="false"/>
+          <w:sz w:val="24"/>
+          <w:szCs w:val="24"/>
+        </w:rPr>
+        <w:t xml:space="preserve">Every sign-in attempt is recorded in login_attempts. After five wrong passwords for one email address, or twenty from one IP address, within fifteen minutes, further attempts are refused with HTTP 429 and a Retry-After header until the window passes, even when the password is correct. Guesses against unregistered emails count as well, and a successful sign-in clears the count for that email.</w:t>
+      </w:r>
+    </w:p>
+    <w:p>
+      <w:pPr>
+        <w:pStyle w:val="Heading2"/>
+        <w:spacing w:after="120" w:before="240"/>
+      </w:pPr>
+      <w:r>
+        <w:rPr>
+          <w:rFonts w:ascii="Times New Roman" w:cs="Times New Roman" w:eastAsia="Times New Roman" w:hAnsi="Times New Roman"/>
+          <w:b/>
+          <w:bCs/>
+          <w:i w:val="false"/>
+          <w:iCs w:val="false"/>
+          <w:sz w:val="24"/>
+          <w:szCs w:val="24"/>
+        </w:rPr>
+        <w:t xml:space="preserve">5.4 Role-Based Access Control</w:t>
       </w:r>
     </w:p>
     <w:p>
@@ -11075,7 +11476,7 @@
                 <w:sz w:val="22"/>
                 <w:szCs w:val="22"/>
               </w:rPr>
-              <w:t xml:space="preserve">Matches the method and path against 65 routes and extracts path parameters.</w:t>
+              <w:t xml:space="preserve">Matches the method and path against 66 routes, at the site root or in a subfolder, and extracts path parameters.</w:t>
             </w:r>
           </w:p>
         </w:tc>
@@ -11370,7 +11771,7 @@
                 <w:sz w:val="22"/>
                 <w:szCs w:val="22"/>
               </w:rPr>
-              <w:t xml:space="preserve">models/, eleven classes</w:t>
+              <w:t xml:space="preserve">models/, twelve classes</w:t>
             </w:r>
           </w:p>
         </w:tc>
@@ -11687,6 +12088,24 @@
     </w:p>
     <w:p>
       <w:pPr>
+        <w:spacing w:after="160" w:line="276"/>
+        <w:jc w:val="both"/>
+      </w:pPr>
+      <w:r>
+        <w:rPr>
+          <w:rFonts w:ascii="Times New Roman" w:cs="Times New Roman" w:eastAsia="Times New Roman" w:hAnsi="Times New Roman"/>
+          <w:b w:val="false"/>
+          <w:bCs w:val="false"/>
+          <w:i w:val="false"/>
+          <w:iCs w:val="false"/>
+          <w:sz w:val="24"/>
+          <w:szCs w:val="24"/>
+        </w:rPr>
+        <w:t xml:space="preserve">Apache withholds the Authorization header from PHP by default, so .htaccess forwards it; without that rule every signed-in request would be rejected once deployed. Uploaded photos are kept outside the web root and served only through GET /api/photos/{id}, which applies the same visibility rules as the listing and reads files only from the upload folder.</w:t>
+      </w:r>
+    </w:p>
+    <w:p>
+      <w:pPr>
         <w:pStyle w:val="Heading2"/>
         <w:spacing w:after="120" w:before="240"/>
       </w:pPr>
@@ -11718,7 +12137,7 @@
           <w:sz w:val="24"/>
           <w:szCs w:val="24"/>
         </w:rPr>
-        <w:t xml:space="preserve">The API exposes 65 routes. Table 6 summarises them by group and required access.</w:t>
+        <w:t xml:space="preserve">The API exposes 66 routes. Table 6 summarises them by group and required access.</w:t>
       </w:r>
     </w:p>
     <w:p>
@@ -12104,7 +12523,7 @@
                 <w:sz w:val="22"/>
                 <w:szCs w:val="22"/>
               </w:rPr>
-              <w:t xml:space="preserve">Public catalogue</w:t>
+              <w:t xml:space="preserve">Public catalogue and photos</w:t>
             </w:r>
           </w:p>
         </w:tc>
@@ -12139,7 +12558,7 @@
                 <w:sz w:val="22"/>
                 <w:szCs w:val="22"/>
               </w:rPr>
-              <w:t xml:space="preserve">2</w:t>
+              <w:t xml:space="preserve">3</w:t>
             </w:r>
           </w:p>
         </w:tc>
@@ -12209,7 +12628,7 @@
                 <w:sz w:val="22"/>
                 <w:szCs w:val="22"/>
               </w:rPr>
-              <w:t xml:space="preserve">GET /api/listings</w:t>
+              <w:t xml:space="preserve">GET /api/photos/{id}</w:t>
             </w:r>
           </w:p>
         </w:tc>
@@ -13879,7 +14298,7 @@
           <w:sz w:val="24"/>
           <w:szCs w:val="24"/>
         </w:rPr>
-        <w:t xml:space="preserve">The backend was run on a local Apache, MariaDB, and PHP environment against a freshly seeded database and exercised through its HTTP interface. Two hundred thirty-four checks covered both the accepted path and the rejected path of each rule, and inspected the database afterwards to confirm side effects were saved rather than merely reported. All 234 passed. Table 7 records the checks by area.</w:t>
+        <w:t xml:space="preserve">The backend was run on a local Apache, MariaDB, and PHP environment against a freshly seeded database and exercised through its HTTP interface. The suites ran through Apache, at the site root and in a subfolder, and through the PHP built-in server. They hold 243 functional checks, covering both the accepted and the rejected path of each rule and inspecting the database afterwards, plus 40 security probes for SQL injection, forged and expired tokens, mass assignment, access to records of other members, disguised uploads, stored XSS, and brute-force sign-in. All 283 passed on every server. Table 7 records the checks by area.</w:t>
       </w:r>
     </w:p>
     <w:p>
@@ -14523,7 +14942,7 @@
                 <w:sz w:val="22"/>
                 <w:szCs w:val="22"/>
               </w:rPr>
-              <w:t xml:space="preserve">Listings</w:t>
+              <w:t xml:space="preserve">Listings and photos</w:t>
             </w:r>
           </w:p>
         </w:tc>
@@ -14558,7 +14977,7 @@
                 <w:sz w:val="22"/>
                 <w:szCs w:val="22"/>
               </w:rPr>
-              <w:t xml:space="preserve">17</w:t>
+              <w:t xml:space="preserve">26</w:t>
             </w:r>
           </w:p>
         </w:tc>
@@ -14593,7 +15012,7 @@
                 <w:sz w:val="22"/>
                 <w:szCs w:val="22"/>
               </w:rPr>
-              <w:t xml:space="preserve">A text file renamed to .png is refused as a photo.</w:t>
+              <w:t xml:space="preserve">A photo of an unverified listing is served only to its owner and moderators.</w:t>
             </w:r>
           </w:p>
         </w:tc>
@@ -15158,6 +15577,116 @@
             <w:tcBorders>
               <w:top w:val="none" w:color="FFFFFF" w:sz="0"/>
               <w:left w:val="none" w:color="FFFFFF" w:sz="0"/>
+              <w:bottom w:val="none" w:color="FFFFFF" w:sz="0"/>
+              <w:right w:val="none" w:color="FFFFFF" w:sz="0"/>
+            </w:tcBorders>
+            <w:tcMar>
+              <w:top w:type="dxa" w:w="60"/>
+              <w:left w:type="dxa" w:w="80"/>
+              <w:bottom w:type="dxa" w:w="60"/>
+              <w:right w:type="dxa" w:w="80"/>
+            </w:tcMar>
+            <w:vAlign w:val="top"/>
+          </w:tcPr>
+          <w:p>
+            <w:pPr>
+              <w:spacing w:after="0" w:line="240"/>
+            </w:pPr>
+            <w:r>
+              <w:rPr>
+                <w:rFonts w:ascii="Times New Roman" w:cs="Times New Roman" w:eastAsia="Times New Roman" w:hAnsi="Times New Roman"/>
+                <w:b w:val="false"/>
+                <w:bCs w:val="false"/>
+                <w:i w:val="false"/>
+                <w:iCs w:val="false"/>
+                <w:sz w:val="22"/>
+                <w:szCs w:val="22"/>
+              </w:rPr>
+              <w:t xml:space="preserve">Errors, headers, CORS</w:t>
+            </w:r>
+          </w:p>
+        </w:tc>
+        <w:tc>
+          <w:tcPr>
+            <w:tcW w:type="dxa" w:w="900"/>
+            <w:tcBorders>
+              <w:top w:val="none" w:color="FFFFFF" w:sz="0"/>
+              <w:left w:val="none" w:color="FFFFFF" w:sz="0"/>
+              <w:bottom w:val="none" w:color="FFFFFF" w:sz="0"/>
+              <w:right w:val="none" w:color="FFFFFF" w:sz="0"/>
+            </w:tcBorders>
+            <w:tcMar>
+              <w:top w:type="dxa" w:w="60"/>
+              <w:left w:type="dxa" w:w="80"/>
+              <w:bottom w:type="dxa" w:w="60"/>
+              <w:right w:type="dxa" w:w="80"/>
+            </w:tcMar>
+            <w:vAlign w:val="top"/>
+          </w:tcPr>
+          <w:p>
+            <w:pPr>
+              <w:spacing w:after="0" w:line="240"/>
+            </w:pPr>
+            <w:r>
+              <w:rPr>
+                <w:rFonts w:ascii="Times New Roman" w:cs="Times New Roman" w:eastAsia="Times New Roman" w:hAnsi="Times New Roman"/>
+                <w:b w:val="false"/>
+                <w:bCs w:val="false"/>
+                <w:i w:val="false"/>
+                <w:iCs w:val="false"/>
+                <w:sz w:val="22"/>
+                <w:szCs w:val="22"/>
+              </w:rPr>
+              <w:t xml:space="preserve">11</w:t>
+            </w:r>
+          </w:p>
+        </w:tc>
+        <w:tc>
+          <w:tcPr>
+            <w:tcW w:type="dxa" w:w="5860"/>
+            <w:tcBorders>
+              <w:top w:val="none" w:color="FFFFFF" w:sz="0"/>
+              <w:left w:val="none" w:color="FFFFFF" w:sz="0"/>
+              <w:bottom w:val="none" w:color="FFFFFF" w:sz="0"/>
+              <w:right w:val="none" w:color="FFFFFF" w:sz="0"/>
+            </w:tcBorders>
+            <w:tcMar>
+              <w:top w:type="dxa" w:w="60"/>
+              <w:left w:type="dxa" w:w="80"/>
+              <w:bottom w:type="dxa" w:w="60"/>
+              <w:right w:type="dxa" w:w="80"/>
+            </w:tcMar>
+            <w:vAlign w:val="top"/>
+          </w:tcPr>
+          <w:p>
+            <w:pPr>
+              <w:spacing w:after="0" w:line="240"/>
+            </w:pPr>
+            <w:r>
+              <w:rPr>
+                <w:rFonts w:ascii="Times New Roman" w:cs="Times New Roman" w:eastAsia="Times New Roman" w:hAnsi="Times New Roman"/>
+                <w:b w:val="false"/>
+                <w:bCs w:val="false"/>
+                <w:i w:val="false"/>
+                <w:iCs w:val="false"/>
+                <w:sz w:val="22"/>
+                <w:szCs w:val="22"/>
+              </w:rPr>
+              <w:t xml:space="preserve">An uncaught exception returns a generic JSON 500 with no internal detail.</w:t>
+            </w:r>
+          </w:p>
+        </w:tc>
+      </w:tr>
+      <w:tr>
+        <w:trPr>
+          <w:cantSplit/>
+        </w:trPr>
+        <w:tc>
+          <w:tcPr>
+            <w:tcW w:type="dxa" w:w="2600"/>
+            <w:tcBorders>
+              <w:top w:val="none" w:color="FFFFFF" w:sz="0"/>
+              <w:left w:val="none" w:color="FFFFFF" w:sz="0"/>
               <w:bottom w:val="single" w:color="000000" w:sz="6"/>
               <w:right w:val="none" w:color="FFFFFF" w:sz="0"/>
             </w:tcBorders>
@@ -15183,7 +15712,7 @@
                 <w:sz w:val="22"/>
                 <w:szCs w:val="22"/>
               </w:rPr>
-              <w:t xml:space="preserve">Errors, headers, CORS</w:t>
+              <w:t xml:space="preserve">Security probes</w:t>
             </w:r>
           </w:p>
         </w:tc>
@@ -15218,7 +15747,7 @@
                 <w:sz w:val="22"/>
                 <w:szCs w:val="22"/>
               </w:rPr>
-              <w:t xml:space="preserve">11</w:t>
+              <w:t xml:space="preserve">40</w:t>
             </w:r>
           </w:p>
         </w:tc>
@@ -15253,7 +15782,7 @@
                 <w:sz w:val="22"/>
                 <w:szCs w:val="22"/>
               </w:rPr>
-              <w:t xml:space="preserve">An uncaught exception returns a generic JSON 500 with no internal detail.</w:t>
+              <w:t xml:space="preserve">After five wrong passwords, even the correct one is refused with HTTP 429.</w:t>
             </w:r>
           </w:p>
         </w:tc>
@@ -15274,7 +15803,7 @@
           <w:sz w:val="24"/>
           <w:szCs w:val="24"/>
         </w:rPr>
-        <w:t xml:space="preserve">Two defects were found during verification and corrected. An accepted request whose exchange had later been cancelled still counted as active, which prevented the member from ever requesting that book again; the check now considers the state of the exchange. Creating a handover slot returned HTTP 500 because a character written directly after a variable in a string was read as part of the variable’s name.</w:t>
+        <w:t xml:space="preserve">Four defects were found during verification and corrected. An accepted request whose exchange had later been cancelled still counted as active, which prevented the member from ever requesting that book again; the check now considers the state of the exchange. Creating a handover slot returned HTTP 500 because a character written directly after a variable in a string was read as part of the variable’s name. Running the suites through real Apache showed that Apache did not pass the Authorization header to PHP, so every signed-in request was rejected, and that PHP and the database used time zones six hours apart, which could put slots and reports on the wrong day. Both are fixed: .htaccess forwards the header, and one APP_TIMEZONE setting now applies to PHP and every database session.</w:t>
       </w:r>
     </w:p>
     <w:sectPr>

</xml_diff>